<commit_message>
1.2.1 requirements: seed accounts from company listings, research web first
R7.1a-c: the initial account list comes from per-country company listings
(largest-company rankings, business directories, registries), not LinkedIn.
Section 7a: traded companies first from their filings, every account's own
website read, LinkedIn only to fill gaps and verify.

Co-Authored-By: Claude Opus 5.5 <noreply@anthropic.com>
</commit_message>
<xml_diff>
--- a/ONBOARDING_RESEARCH_REQUIREMENTS.docx
+++ b/ONBOARDING_RESEARCH_REQUIREMENTS.docx
@@ -3547,93 +3547,29 @@
         <w:rPr>
           <w:b/>
         </w:rPr>
-        <w:t>R7.2 — Every candidate arrives with evidence</w:t>
-      </w:r>
-      <w:r>
-        <w:rPr>
-          <w:b w:val="0"/>
-        </w:rPr>
-        <w:t>: name, website, HQ country, one line on why it fits,</w:t>
-      </w:r>
-    </w:p>
-    <w:p>
-      <w:r>
-        <w:rPr>
-          <w:b w:val="0"/>
-        </w:rPr>
-        <w:t xml:space="preserve">and the source URL(s) it was found on. </w:t>
-      </w:r>
-      <w:r>
-        <w:rPr>
-          <w:b/>
-        </w:rPr>
-        <w:t>A candidate without a source is discarded.</w:t>
-      </w:r>
-      <w:r>
-        <w:rPr>
-          <w:b w:val="0"/>
-        </w:rPr>
-        <w:t xml:space="preserve"> A LinkedIn</w:t>
-      </w:r>
-    </w:p>
-    <w:p>
-      <w:r>
-        <w:rPr>
-          <w:b w:val="0"/>
-        </w:rPr>
-        <w:t>company URL is kept only if a cited source shows it, and even then it is **verified by the</w:t>
-      </w:r>
-    </w:p>
-    <w:p>
-      <w:r>
-        <w:rPr>
-          <w:b w:val="0"/>
-        </w:rPr>
-        <w:t>pipeline's resolve job** before it counts. Nothing is ever guessed.</w:t>
-      </w:r>
-    </w:p>
-    <w:p>
-      <w:r>
-        <w:rPr>
-          <w:b/>
-        </w:rPr>
-        <w:t>R7.3 — Candidates enter at Resolve identity</w:t>
-      </w:r>
-      <w:r>
-        <w:rPr>
-          <w:b w:val="0"/>
-        </w:rPr>
-        <w:t>, like an imported workbook, and merge automatically</w:t>
-      </w:r>
-    </w:p>
-    <w:p>
-      <w:r>
-        <w:rPr>
-          <w:b w:val="0"/>
-        </w:rPr>
-        <w:t>(the silent tier, as for LinkedIn Discovery in 1.2.0 R12.6): logged, reported in aggregate</w:t>
-      </w:r>
-    </w:p>
-    <w:p>
-      <w:r>
-        <w:rPr>
-          <w:b w:val="0"/>
-        </w:rPr>
-        <w:t>(*"Web Discovery added 38 companies"*) and undoable by the existing soft delete.</w:t>
-      </w:r>
-    </w:p>
-    <w:p>
-      <w:r>
-        <w:rPr>
-          <w:b/>
-        </w:rPr>
-        <w:t>R7.4 — Deduplication, before anything is added</w:t>
-      </w:r>
-      <w:r>
-        <w:rPr>
-          <w:b w:val="0"/>
-        </w:rPr>
-        <w:t>, against:</w:t>
+        <w:t>R7.1a — The initial list comes from company listings, not from LinkedIn (decided 2026-09-28).</w:t>
+      </w:r>
+      <w:r>
+        <w:rPr>
+          <w:b w:val="0"/>
+        </w:rPr>
+        <w:t xml:space="preserve"> The</w:t>
+      </w:r>
+    </w:p>
+    <w:p>
+      <w:r>
+        <w:rPr>
+          <w:b w:val="0"/>
+        </w:rPr>
+        <w:t>first accounts are built from published listings of companies in each target country, found by web</w:t>
+      </w:r>
+    </w:p>
+    <w:p>
+      <w:r>
+        <w:rPr>
+          <w:b w:val="0"/>
+        </w:rPr>
+        <w:t>search. For example:</w:t>
       </w:r>
     </w:p>
     <w:p>
@@ -3642,9 +3578,23 @@
       </w:pPr>
       <w:r>
         <w:rPr>
-          <w:b w:val="0"/>
-        </w:rPr>
-        <w:t>existing accounts (by LinkedIn id, website domain and normalised name);</w:t>
+          <w:b/>
+        </w:rPr>
+        <w:t>rankings of the largest companies</w:t>
+      </w:r>
+      <w:r>
+        <w:rPr>
+          <w:b w:val="0"/>
+        </w:rPr>
+        <w:t xml:space="preserve"> in country X (*"top 100 largest companies in Switzerland"*,</w:t>
+      </w:r>
+    </w:p>
+    <w:p>
+      <w:r>
+        <w:rPr>
+          <w:b w:val="0"/>
+        </w:rPr>
+        <w:t xml:space="preserve">  by employees or revenue), from business press, statistics offices and similar publishers;</w:t>
       </w:r>
     </w:p>
     <w:p>
@@ -3655,13 +3605,13 @@
         <w:rPr>
           <w:b/>
         </w:rPr>
-        <w:t>accounts the user removed</w:t>
-      </w:r>
-      <w:r>
-        <w:rPr>
-          <w:b w:val="0"/>
-        </w:rPr>
-        <w:t xml:space="preserve"> — a removed account is never brought back by discovery;</w:t>
+        <w:t>business directories</w:t>
+      </w:r>
+      <w:r>
+        <w:rPr>
+          <w:b w:val="0"/>
+        </w:rPr>
+        <w:t xml:space="preserve"> that exist for every country, such as Dun &amp; Bradstreet's;</w:t>
       </w:r>
     </w:p>
     <w:p>
@@ -3670,17 +3620,31 @@
       </w:pPr>
       <w:r>
         <w:rPr>
-          <w:b w:val="0"/>
-        </w:rPr>
-        <w:t>the exclusion list (competitors, customers, partners, recruiters), by LinkedIn URL, name or website</w:t>
-      </w:r>
-    </w:p>
-    <w:p>
-      <w:r>
-        <w:rPr>
-          <w:b w:val="0"/>
-        </w:rPr>
-        <w:t xml:space="preserve">  domain;</w:t>
+          <w:b/>
+        </w:rPr>
+        <w:t>official company registries</w:t>
+      </w:r>
+      <w:r>
+        <w:rPr>
+          <w:b w:val="0"/>
+        </w:rPr>
+        <w:t>, such as Zefix for Switzerland and its equivalents elsewhere — these</w:t>
+      </w:r>
+    </w:p>
+    <w:p>
+      <w:r>
+        <w:rPr>
+          <w:b w:val="0"/>
+        </w:rPr>
+        <w:t xml:space="preserve">  list every registered company but do not rank them, so they mainly confirm identity, legal name and</w:t>
+      </w:r>
+    </w:p>
+    <w:p>
+      <w:r>
+        <w:rPr>
+          <w:b w:val="0"/>
+        </w:rPr>
+        <w:t xml:space="preserve">  address (the workbook's existing Registry fields);</w:t>
       </w:r>
     </w:p>
     <w:p>
@@ -3691,7 +3655,237 @@
         <w:rPr>
           <w:b w:val="0"/>
         </w:rPr>
-        <w:t>the seller's own company;</w:t>
+        <w:t>any other web source that answers the same question for that country.</w:t>
+      </w:r>
+    </w:p>
+    <w:p>
+      <w:r>
+        <w:rPr>
+          <w:b w:val="0"/>
+        </w:rPr>
+        <w:t>Listings are the fastest way to a solid starting list: the companies on them demonstrably exist, and</w:t>
+      </w:r>
+    </w:p>
+    <w:p>
+      <w:r>
+        <w:rPr>
+          <w:b w:val="0"/>
+        </w:rPr>
+        <w:t>the source already states size, HQ and often industry.</w:t>
+      </w:r>
+    </w:p>
+    <w:p>
+      <w:r>
+        <w:rPr>
+          <w:b/>
+        </w:rPr>
+        <w:t>R7.1b — LinkedIn is assumed, and checked afterwards.</w:t>
+      </w:r>
+      <w:r>
+        <w:rPr>
+          <w:b w:val="0"/>
+        </w:rPr>
+        <w:t xml:space="preserve"> Practically all companies on a national</w:t>
+      </w:r>
+    </w:p>
+    <w:p>
+      <w:r>
+        <w:rPr>
+          <w:b w:val="0"/>
+        </w:rPr>
+        <w:t>top-100 list have a LinkedIn company page; one or two exceptions are expected and not a concern. The</w:t>
+      </w:r>
+    </w:p>
+    <w:p>
+      <w:r>
+        <w:rPr>
+          <w:b w:val="0"/>
+        </w:rPr>
+        <w:t>list is therefore built without LinkedIn, and LinkedIn confirms each company after onboarding</w:t>
+      </w:r>
+    </w:p>
+    <w:p>
+      <w:r>
+        <w:rPr>
+          <w:b w:val="0"/>
+        </w:rPr>
+        <w:t>(R3.4.1). An exception simply ends as Lacking evidence (R7.7).</w:t>
+      </w:r>
+    </w:p>
+    <w:p>
+      <w:r>
+        <w:rPr>
+          <w:b/>
+        </w:rPr>
+        <w:t>R7.1c — The listing is chosen to match the targeting.</w:t>
+      </w:r>
+      <w:r>
+        <w:rPr>
+          <w:b w:val="0"/>
+        </w:rPr>
+        <w:t xml:space="preserve"> A top-100-largest list fits a seller whose</w:t>
+      </w:r>
+    </w:p>
+    <w:p>
+      <w:r>
+        <w:rPr>
+          <w:b w:val="0"/>
+        </w:rPr>
+        <w:t>size targets are large companies. If the wizard's size bands, industries or organisation types point</w:t>
+      </w:r>
+    </w:p>
+    <w:p>
+      <w:r>
+        <w:rPr>
+          <w:b w:val="0"/>
+        </w:rPr>
+        <w:t>elsewhere (e.g. mid-sized manufacturers, hospitals), the search asks for listings of *those* (a</w:t>
+      </w:r>
+    </w:p>
+    <w:p>
+      <w:r>
+        <w:rPr>
+          <w:b w:val="0"/>
+        </w:rPr>
+        <w:t>ranking by industry, a directory filtered by size, a list of hospitals), and the companies taken from</w:t>
+      </w:r>
+    </w:p>
+    <w:p>
+      <w:r>
+        <w:rPr>
+          <w:b w:val="0"/>
+        </w:rPr>
+        <w:t>any listing are filtered by the wizard's size, industry and exclusion answers before they are added.</w:t>
+      </w:r>
+    </w:p>
+    <w:p>
+      <w:r>
+        <w:rPr>
+          <w:b w:val="0"/>
+        </w:rPr>
+        <w:t>The fit-driven search of the Master Prompt (its section 25: subsidiaries, regional headquarters,</w:t>
+      </w:r>
+    </w:p>
+    <w:p>
+      <w:r>
+        <w:rPr>
+          <w:b w:val="0"/>
+        </w:rPr>
+        <w:t xml:space="preserve">public bodies, companies surfaced through relevant initiatives) </w:t>
+      </w:r>
+      <w:r>
+        <w:rPr>
+          <w:b/>
+        </w:rPr>
+        <w:t>adds</w:t>
+      </w:r>
+      <w:r>
+        <w:rPr>
+          <w:b w:val="0"/>
+        </w:rPr>
+        <w:t xml:space="preserve"> to the listings; it does not</w:t>
+      </w:r>
+    </w:p>
+    <w:p>
+      <w:r>
+        <w:rPr>
+          <w:b w:val="0"/>
+        </w:rPr>
+        <w:t>replace them.</w:t>
+      </w:r>
+    </w:p>
+    <w:p>
+      <w:r>
+        <w:rPr>
+          <w:b/>
+        </w:rPr>
+        <w:t>R7.2 — Every candidate arrives with evidence</w:t>
+      </w:r>
+      <w:r>
+        <w:rPr>
+          <w:b w:val="0"/>
+        </w:rPr>
+        <w:t>: name, website, HQ country, one line on why it fits,</w:t>
+      </w:r>
+    </w:p>
+    <w:p>
+      <w:r>
+        <w:rPr>
+          <w:b w:val="0"/>
+        </w:rPr>
+        <w:t xml:space="preserve">and the source URL(s) it was found on. </w:t>
+      </w:r>
+      <w:r>
+        <w:rPr>
+          <w:b/>
+        </w:rPr>
+        <w:t>A candidate without a source is discarded.</w:t>
+      </w:r>
+      <w:r>
+        <w:rPr>
+          <w:b w:val="0"/>
+        </w:rPr>
+        <w:t xml:space="preserve"> A LinkedIn</w:t>
+      </w:r>
+    </w:p>
+    <w:p>
+      <w:r>
+        <w:rPr>
+          <w:b w:val="0"/>
+        </w:rPr>
+        <w:t>company URL is kept only if a cited source shows it, and even then it is **verified by the</w:t>
+      </w:r>
+    </w:p>
+    <w:p>
+      <w:r>
+        <w:rPr>
+          <w:b w:val="0"/>
+        </w:rPr>
+        <w:t>pipeline's resolve job** before it counts. Nothing is ever guessed.</w:t>
+      </w:r>
+    </w:p>
+    <w:p>
+      <w:r>
+        <w:rPr>
+          <w:b/>
+        </w:rPr>
+        <w:t>R7.3 — Candidates enter at Resolve identity</w:t>
+      </w:r>
+      <w:r>
+        <w:rPr>
+          <w:b w:val="0"/>
+        </w:rPr>
+        <w:t>, like an imported workbook, and merge automatically</w:t>
+      </w:r>
+    </w:p>
+    <w:p>
+      <w:r>
+        <w:rPr>
+          <w:b w:val="0"/>
+        </w:rPr>
+        <w:t>(the silent tier, as for LinkedIn Discovery in 1.2.0 R12.6): logged, reported in aggregate</w:t>
+      </w:r>
+    </w:p>
+    <w:p>
+      <w:r>
+        <w:rPr>
+          <w:b w:val="0"/>
+        </w:rPr>
+        <w:t>(*"Web Discovery added 38 companies"*) and undoable by the existing soft delete.</w:t>
+      </w:r>
+    </w:p>
+    <w:p>
+      <w:r>
+        <w:rPr>
+          <w:b/>
+        </w:rPr>
+        <w:t>R7.4 — Deduplication, before anything is added</w:t>
+      </w:r>
+      <w:r>
+        <w:rPr>
+          <w:b w:val="0"/>
+        </w:rPr>
+        <w:t>, against:</w:t>
       </w:r>
     </w:p>
     <w:p>
@@ -3702,6 +3896,64 @@
         <w:rPr>
           <w:b w:val="0"/>
         </w:rPr>
+        <w:t>existing accounts (by LinkedIn id, website domain and normalised name);</w:t>
+      </w:r>
+    </w:p>
+    <w:p>
+      <w:pPr>
+        <w:pStyle w:val="ListBullet"/>
+      </w:pPr>
+      <w:r>
+        <w:rPr>
+          <w:b/>
+        </w:rPr>
+        <w:t>accounts the user removed</w:t>
+      </w:r>
+      <w:r>
+        <w:rPr>
+          <w:b w:val="0"/>
+        </w:rPr>
+        <w:t xml:space="preserve"> — a removed account is never brought back by discovery;</w:t>
+      </w:r>
+    </w:p>
+    <w:p>
+      <w:pPr>
+        <w:pStyle w:val="ListBullet"/>
+      </w:pPr>
+      <w:r>
+        <w:rPr>
+          <w:b w:val="0"/>
+        </w:rPr>
+        <w:t>the exclusion list (competitors, customers, partners, recruiters), by LinkedIn URL, name or website</w:t>
+      </w:r>
+    </w:p>
+    <w:p>
+      <w:r>
+        <w:rPr>
+          <w:b w:val="0"/>
+        </w:rPr>
+        <w:t xml:space="preserve">  domain;</w:t>
+      </w:r>
+    </w:p>
+    <w:p>
+      <w:pPr>
+        <w:pStyle w:val="ListBullet"/>
+      </w:pPr>
+      <w:r>
+        <w:rPr>
+          <w:b w:val="0"/>
+        </w:rPr>
+        <w:t>the seller's own company;</w:t>
+      </w:r>
+    </w:p>
+    <w:p>
+      <w:pPr>
+        <w:pStyle w:val="ListBullet"/>
+      </w:pPr>
+      <w:r>
+        <w:rPr>
+          <w:b w:val="0"/>
+        </w:rPr>
         <w:t>candidates already rejected by the pipeline (Lacking evidence).</w:t>
       </w:r>
     </w:p>
@@ -3744,15 +3996,15 @@
         <w:rPr>
           <w:b w:val="0"/>
         </w:rPr>
-        <w:t xml:space="preserve"> Discovery returns the strongest-fitting organisations first, so that the</w:t>
-      </w:r>
-    </w:p>
-    <w:p>
-      <w:r>
-        <w:rPr>
-          <w:b w:val="0"/>
-        </w:rPr>
-        <w:t>first days of the Build clock produce the best accounts. This is 1.2.0's depth-first rule applied to</w:t>
+        <w:t xml:space="preserve"> From the listings and the searches, discovery adds the strongest-fitting</w:t>
+      </w:r>
+    </w:p>
+    <w:p>
+      <w:r>
+        <w:rPr>
+          <w:b w:val="0"/>
+        </w:rPr>
+        <w:t>organisations first, so that the first days of the Build clock produce the best accounts. This is 1.2.0's depth-first rule applied to</w:t>
       </w:r>
     </w:p>
     <w:p>
@@ -3919,6 +4171,421 @@
         <w:rPr>
           <w:b w:val="0"/>
         </w:rPr>
+        <w:t>7a. Researching each account: web first, LinkedIn last (decided 2026-09-28)</w:t>
+      </w:r>
+    </w:p>
+    <w:p>
+      <w:r>
+        <w:rPr>
+          <w:b w:val="0"/>
+        </w:rPr>
+        <w:t>Once a company is on the list (section 7), it needs what the Ready bar and the targets ask for: its</w:t>
+      </w:r>
+    </w:p>
+    <w:p>
+      <w:r>
+        <w:rPr>
+          <w:b/>
+        </w:rPr>
+        <w:t>size in employees</w:t>
+      </w:r>
+      <w:r>
+        <w:rPr>
+          <w:b w:val="0"/>
+        </w:rPr>
+        <w:t xml:space="preserve">, its </w:t>
+      </w:r>
+      <w:r>
+        <w:rPr>
+          <w:b/>
+        </w:rPr>
+        <w:t>HQ location</w:t>
+      </w:r>
+      <w:r>
+        <w:rPr>
+          <w:b w:val="0"/>
+        </w:rPr>
+        <w:t xml:space="preserve">, optionally its </w:t>
+      </w:r>
+      <w:r>
+        <w:rPr>
+          <w:b/>
+        </w:rPr>
+        <w:t>revenue</w:t>
+      </w:r>
+      <w:r>
+        <w:rPr>
+          <w:b w:val="0"/>
+        </w:rPr>
+        <w:t xml:space="preserve">, and then </w:t>
+      </w:r>
+      <w:r>
+        <w:rPr>
+          <w:b/>
+        </w:rPr>
+        <w:t>initiatives</w:t>
+      </w:r>
+      <w:r>
+        <w:rPr>
+          <w:b w:val="0"/>
+        </w:rPr>
+        <w:t xml:space="preserve"> and</w:t>
+      </w:r>
+    </w:p>
+    <w:p>
+      <w:r>
+        <w:rPr>
+          <w:b/>
+        </w:rPr>
+        <w:t>contacts</w:t>
+      </w:r>
+      <w:r>
+        <w:rPr>
+          <w:b w:val="0"/>
+        </w:rPr>
+        <w:t>. Most of this is published, and the web is the cheaper and faster place to get it.</w:t>
+      </w:r>
+    </w:p>
+    <w:p>
+      <w:r>
+        <w:rPr>
+          <w:b/>
+        </w:rPr>
+        <w:t>R7a.1 — Traded companies first, from their own filings.</w:t>
+      </w:r>
+      <w:r>
+        <w:rPr>
+          <w:b w:val="0"/>
+        </w:rPr>
+        <w:t xml:space="preserve"> For a publicly traded company, the annual</w:t>
+      </w:r>
+    </w:p>
+    <w:p>
+      <w:r>
+        <w:rPr>
+          <w:b w:val="0"/>
+        </w:rPr>
+        <w:t>and quarterly reports and its press releases are the best single source for almost everything</w:t>
+      </w:r>
+    </w:p>
+    <w:p>
+      <w:r>
+        <w:rPr>
+          <w:b w:val="0"/>
+        </w:rPr>
+        <w:t>needed: HQ location, employees, revenue, initiatives, management, budgets and investments. Web</w:t>
+      </w:r>
+    </w:p>
+    <w:p>
+      <w:r>
+        <w:rPr>
+          <w:b w:val="0"/>
+        </w:rPr>
+        <w:t>research looks for these first. Traded companies are researched before the others.</w:t>
+      </w:r>
+    </w:p>
+    <w:p>
+      <w:r>
+        <w:rPr>
+          <w:b/>
+        </w:rPr>
+        <w:t>R7a.2 — Every account's own website is read.</w:t>
+      </w:r>
+      <w:r>
+        <w:rPr>
+          <w:b w:val="0"/>
+        </w:rPr>
+        <w:t xml:space="preserve"> For each company, research opens its website and takes</w:t>
+      </w:r>
+    </w:p>
+    <w:p>
+      <w:r>
+        <w:rPr>
+          <w:b w:val="0"/>
+        </w:rPr>
+        <w:t>as much as is relevant from it: HQ location, number of employees (mainly for companies that are not</w:t>
+      </w:r>
+    </w:p>
+    <w:p>
+      <w:r>
+        <w:rPr>
+          <w:b w:val="0"/>
+        </w:rPr>
+        <w:t xml:space="preserve">traded, where no filing gives it), initiatives, </w:t>
+      </w:r>
+      <w:r>
+        <w:rPr>
+          <w:b/>
+        </w:rPr>
+        <w:t>C-level and management names with their titles</w:t>
+      </w:r>
+      <w:r>
+        <w:rPr>
+          <w:b w:val="0"/>
+        </w:rPr>
+        <w:t>,</w:t>
+      </w:r>
+    </w:p>
+    <w:p>
+      <w:r>
+        <w:rPr>
+          <w:b w:val="0"/>
+        </w:rPr>
+        <w:t>and a short summary of the company.</w:t>
+      </w:r>
+    </w:p>
+    <w:p>
+      <w:r>
+        <w:rPr>
+          <w:b/>
+        </w:rPr>
+        <w:t>R7a.3 — Private companies, non-profits, associations and public bodies come second.</w:t>
+      </w:r>
+      <w:r>
+        <w:rPr>
+          <w:b w:val="0"/>
+        </w:rPr>
+        <w:t xml:space="preserve"> They publish</w:t>
+      </w:r>
+    </w:p>
+    <w:p>
+      <w:r>
+        <w:rPr>
+          <w:b w:val="0"/>
+        </w:rPr>
+        <w:t>less, so they are harder to complete from the web. They are researched after the traded companies,</w:t>
+      </w:r>
+    </w:p>
+    <w:p>
+      <w:r>
+        <w:rPr>
+          <w:b w:val="0"/>
+        </w:rPr>
+        <w:t>and are expected to rely on LinkedIn more often for the fields the web did not give.</w:t>
+      </w:r>
+    </w:p>
+    <w:p>
+      <w:r>
+        <w:rPr>
+          <w:b/>
+        </w:rPr>
+        <w:t>R7a.4 — LinkedIn only fills gaps and verifies.</w:t>
+      </w:r>
+      <w:r>
+        <w:rPr>
+          <w:b w:val="0"/>
+        </w:rPr>
+        <w:t xml:space="preserve"> After the web research, LinkedIn is used for two</w:t>
+      </w:r>
+    </w:p>
+    <w:p>
+      <w:r>
+        <w:rPr>
+          <w:b w:val="0"/>
+        </w:rPr>
+        <w:t>things only:</w:t>
+      </w:r>
+    </w:p>
+    <w:p>
+      <w:pPr>
+        <w:pStyle w:val="ListBullet"/>
+      </w:pPr>
+      <w:r>
+        <w:rPr>
+          <w:b/>
+        </w:rPr>
+        <w:t>to find what is still missing</w:t>
+      </w:r>
+      <w:r>
+        <w:rPr>
+          <w:b w:val="0"/>
+        </w:rPr>
+        <w:t xml:space="preserve"> — for example the employee count of a private company whose</w:t>
+      </w:r>
+    </w:p>
+    <w:p>
+      <w:r>
+        <w:rPr>
+          <w:b w:val="0"/>
+        </w:rPr>
+        <w:t xml:space="preserve">  website does not state it, or contacts where the web gave none;</w:t>
+      </w:r>
+    </w:p>
+    <w:p>
+      <w:pPr>
+        <w:pStyle w:val="ListBullet"/>
+      </w:pPr>
+      <w:r>
+        <w:rPr>
+          <w:b/>
+        </w:rPr>
+        <w:t>to verify what the web research found</w:t>
+      </w:r>
+      <w:r>
+        <w:rPr>
+          <w:b w:val="0"/>
+        </w:rPr>
+        <w:t xml:space="preserve"> — the company page (which the Scanner needs in any case,</w:t>
+      </w:r>
+    </w:p>
+    <w:p>
+      <w:r>
+        <w:rPr>
+          <w:b w:val="0"/>
+        </w:rPr>
+        <w:t xml:space="preserve">  R7.7) and the LinkedIn profile of each contact found on the web.</w:t>
+      </w:r>
+    </w:p>
+    <w:p>
+      <w:r>
+        <w:rPr>
+          <w:b w:val="0"/>
+        </w:rPr>
+        <w:t xml:space="preserve">It is </w:t>
+      </w:r>
+      <w:r>
+        <w:rPr>
+          <w:b/>
+        </w:rPr>
+        <w:t>not</w:t>
+      </w:r>
+      <w:r>
+        <w:rPr>
+          <w:b w:val="0"/>
+        </w:rPr>
+        <w:t xml:space="preserve"> used to re-fetch a field that web research already found with a cited source; 1.2.0 already</w:t>
+      </w:r>
+    </w:p>
+    <w:p>
+      <w:r>
+        <w:rPr>
+          <w:b w:val="0"/>
+        </w:rPr>
+        <w:t>counts such a field as verified (1.2.0 R5.2).</w:t>
+      </w:r>
+    </w:p>
+    <w:p>
+      <w:r>
+        <w:rPr>
+          <w:b/>
+        </w:rPr>
+        <w:t>R7a.5 — Contacts found on the web are matched to LinkedIn by name.</w:t>
+      </w:r>
+      <w:r>
+        <w:rPr>
+          <w:b w:val="0"/>
+        </w:rPr>
+        <w:t xml:space="preserve"> A contact named on the website or</w:t>
+      </w:r>
+    </w:p>
+    <w:p>
+      <w:r>
+        <w:rPr>
+          <w:b w:val="0"/>
+        </w:rPr>
+        <w:t>in a report (e.g. *"Anna Muster, Chief Operating Officer"*) is looked up on LinkedIn by name, which the</w:t>
+      </w:r>
+    </w:p>
+    <w:p>
+      <w:r>
+        <w:rPr>
+          <w:b w:val="0"/>
+        </w:rPr>
+        <w:t>1.2.0 pipeline already does for contacts without a profile. It counts towards Ready (at least one</w:t>
+      </w:r>
+    </w:p>
+    <w:p>
+      <w:r>
+        <w:rPr>
+          <w:b w:val="0"/>
+        </w:rPr>
+        <w:t>contact at a chosen seniority level with a LinkedIn profile) only once its profile is found. The</w:t>
+      </w:r>
+    </w:p>
+    <w:p>
+      <w:r>
+        <w:rPr>
+          <w:b w:val="0"/>
+        </w:rPr>
+        <w:t>company's LinkedIn People page is searched only when the web gave too few contacts to meet the target.</w:t>
+      </w:r>
+    </w:p>
+    <w:p>
+      <w:r>
+        <w:rPr>
+          <w:b/>
+        </w:rPr>
+        <w:t>R7a.6 — Every value keeps its source.</w:t>
+      </w:r>
+      <w:r>
+        <w:rPr>
+          <w:b w:val="0"/>
+        </w:rPr>
+        <w:t xml:space="preserve"> Each value found (a report, a press release, a page of the</w:t>
+      </w:r>
+    </w:p>
+    <w:p>
+      <w:r>
+        <w:rPr>
+          <w:b w:val="0"/>
+        </w:rPr>
+        <w:t>company's website) is stored with the URL it came from, as web research already does, so the user can</w:t>
+      </w:r>
+    </w:p>
+    <w:p>
+      <w:r>
+        <w:rPr>
+          <w:b w:val="0"/>
+        </w:rPr>
+        <w:t>check it and the arbitration of 1.2.0 can compare it with a LinkedIn value.</w:t>
+      </w:r>
+    </w:p>
+    <w:p>
+      <w:r>
+        <w:rPr>
+          <w:b/>
+        </w:rPr>
+        <w:t>For the design stage:</w:t>
+      </w:r>
+      <w:r>
+        <w:rPr>
+          <w:b w:val="0"/>
+        </w:rPr>
+        <w:t xml:space="preserve"> reading reports and websites costs more per account than 1.2.0's three-search</w:t>
+      </w:r>
+    </w:p>
+    <w:p>
+      <w:r>
+        <w:rPr>
+          <w:b w:val="0"/>
+        </w:rPr>
+        <w:t>depth research, while LinkedIn touches per account should fall (no size fetch when the web gave one;</w:t>
+      </w:r>
+    </w:p>
+    <w:p>
+      <w:r>
+        <w:rPr>
+          <w:b w:val="0"/>
+        </w:rPr>
+        <w:t>fewer People-page searches). Section 8's figures are to be re-measured on this basis. Whether pages</w:t>
+      </w:r>
+    </w:p>
+    <w:p>
+      <w:r>
+        <w:rPr>
+          <w:b w:val="0"/>
+        </w:rPr>
+        <w:t>are opened with a web-fetch tool or through search results is a design choice.</w:t>
+      </w:r>
+    </w:p>
+    <w:p>
+      <w:pPr>
+        <w:pStyle w:val="Heading2"/>
+      </w:pPr>
+      <w:r>
+        <w:rPr>
+          <w:b w:val="0"/>
+        </w:rPr>
         <w:t>8. Time and money, told up front</w:t>
       </w:r>
     </w:p>
@@ -3955,7 +4622,15 @@
         <w:rPr>
           <w:b w:val="0"/>
         </w:rPr>
-        <w:t>measure web discovery before any number is shown to users.</w:t>
+        <w:t>measure web discovery before any number is shown to users. They predate section 7a (web first, LinkedIn last),</w:t>
+      </w:r>
+    </w:p>
+    <w:p>
+      <w:r>
+        <w:rPr>
+          <w:b w:val="0"/>
+        </w:rPr>
+        <w:t>which should raise the web cost and lower the LinkedIn touches per account.</w:t>
       </w:r>
     </w:p>
     <w:tbl>

</xml_diff>

<commit_message>
1.2.1 requirements: R7a.7 one credible source per fact, no repeat searches
Co-Authored-By: Claude Opus 5.5 <noreply@anthropic.com>
</commit_message>
<xml_diff>
--- a/ONBOARDING_RESEARCH_REQUIREMENTS.docx
+++ b/ONBOARDING_RESEARCH_REQUIREMENTS.docx
@@ -4545,6 +4545,123 @@
         <w:rPr>
           <w:b/>
         </w:rPr>
+        <w:t>R7a.7 — As few searches as possible: one credible source per fact is enough (decided 2026-09-28).</w:t>
+      </w:r>
+    </w:p>
+    <w:p>
+      <w:r>
+        <w:rPr>
+          <w:b w:val="0"/>
+        </w:rPr>
+        <w:t xml:space="preserve">Once a fact (employees, revenue, HQ location, …) has </w:t>
+      </w:r>
+      <w:r>
+        <w:rPr>
+          <w:b/>
+        </w:rPr>
+        <w:t>one credible source</w:t>
+      </w:r>
+      <w:r>
+        <w:rPr>
+          <w:b w:val="0"/>
+        </w:rPr>
+        <w:t>, research does not search</w:t>
+      </w:r>
+    </w:p>
+    <w:p>
+      <w:r>
+        <w:rPr>
+          <w:b w:val="0"/>
+        </w:rPr>
+        <w:t>for it again. Each research call is told what is already known and asks only for what is missing,</w:t>
+      </w:r>
+    </w:p>
+    <w:p>
+      <w:r>
+        <w:rPr>
+          <w:b w:val="0"/>
+        </w:rPr>
+        <w:t>so that:</w:t>
+      </w:r>
+    </w:p>
+    <w:p>
+      <w:pPr>
+        <w:pStyle w:val="ListBullet"/>
+      </w:pPr>
+      <w:r>
+        <w:rPr>
+          <w:b w:val="0"/>
+        </w:rPr>
+        <w:t>a listing that already gave employees and HQ (R7.1a) leaves only the rest to find;</w:t>
+      </w:r>
+    </w:p>
+    <w:p>
+      <w:pPr>
+        <w:pStyle w:val="ListBullet"/>
+      </w:pPr>
+      <w:r>
+        <w:rPr>
+          <w:b w:val="0"/>
+        </w:rPr>
+        <w:t>one annual report that gives employees, revenue and HQ together closes all three at once;</w:t>
+      </w:r>
+    </w:p>
+    <w:p>
+      <w:pPr>
+        <w:pStyle w:val="ListBullet"/>
+      </w:pPr>
+      <w:r>
+        <w:rPr>
+          <w:b w:val="0"/>
+        </w:rPr>
+        <w:t>an account with nothing missing gets no further research until its verification expires (1.2.0</w:t>
+      </w:r>
+    </w:p>
+    <w:p>
+      <w:r>
+        <w:rPr>
+          <w:b w:val="0"/>
+        </w:rPr>
+        <w:t xml:space="preserve">  R5.3).</w:t>
+      </w:r>
+    </w:p>
+    <w:p>
+      <w:r>
+        <w:rPr>
+          <w:b w:val="0"/>
+        </w:rPr>
+        <w:t>*Credible* means what 1.2.0 already counts as verified: a cited source of adequate quality (1.2.0</w:t>
+      </w:r>
+    </w:p>
+    <w:p>
+      <w:r>
+        <w:rPr>
+          <w:b w:val="0"/>
+        </w:rPr>
+        <w:t>R5.2). A second source is sought only when the first is not credible enough, or when two sources</w:t>
+      </w:r>
+    </w:p>
+    <w:p>
+      <w:r>
+        <w:rPr>
+          <w:b w:val="0"/>
+        </w:rPr>
+        <w:t>already found disagree in a way that could change a decision (1.2.0 R5.4). The existing</w:t>
+      </w:r>
+    </w:p>
+    <w:p>
+      <w:r>
+        <w:rPr>
+          <w:b w:val="0"/>
+        </w:rPr>
+        <w:t>*only what is missing* mode of web research is the starting point.</w:t>
+      </w:r>
+    </w:p>
+    <w:p>
+      <w:r>
+        <w:rPr>
+          <w:b/>
+        </w:rPr>
         <w:t>For the design stage:</w:t>
       </w:r>
       <w:r>

</xml_diff>